<commit_message>
Add author names to final report
</commit_message>
<xml_diff>
--- a/CS455_Final_Report_Risk_Profiling_RAG.docx
+++ b/CS455_Final_Report_Risk_Profiling_RAG.docx
@@ -259,13 +259,41 @@
       </w:r>
     </w:p>
     <w:p>
+      <w:r>
+        <w:lastRenderedPageBreak/>
+        <w:t xml:space="preserve">Live: </w:t>
+      </w:r>
+      <w:hyperlink r:id="rId7" w:history="1">
+        <w:r>
+          <w:rPr>
+            <w:rStyle w:val="Kpr"/>
+          </w:rPr>
+          <w:t>https://company-risk-profiling-with-rag-ysey7ofzsqh6xemgtw9tb4.streamlit.app/</w:t>
+        </w:r>
+      </w:hyperlink>
+    </w:p>
+    <w:p>
+      <w:proofErr w:type="spellStart"/>
+      <w:r>
+        <w:t>GitHub</w:t>
+      </w:r>
+      <w:proofErr w:type="spellEnd"/>
+      <w:r>
+        <w:t xml:space="preserve">: </w:t>
+      </w:r>
+      <w:r>
+        <w:t>https://github.com/cagatayeroglu/company-risk-profiling-with-rag</w:t>
+      </w:r>
+    </w:p>
+    <w:p/>
+    <w:p/>
+    <w:p>
       <w:pPr>
         <w:pStyle w:val="Balk1"/>
       </w:pPr>
       <w:bookmarkStart w:id="0" w:name="_Toc231745044"/>
       <w:proofErr w:type="spellStart"/>
       <w:r>
-        <w:lastRenderedPageBreak/>
         <w:t>Table</w:t>
       </w:r>
       <w:proofErr w:type="spellEnd"/>
@@ -24283,7 +24311,7 @@
       </w:r>
     </w:p>
     <w:sectPr>
-      <w:footerReference w:type="default" r:id="rId7"/>
+      <w:footerReference w:type="default" r:id="rId8"/>
       <w:pgSz w:w="12240" w:h="15840"/>
       <w:pgMar w:top="1440" w:right="1440" w:bottom="1440" w:left="1440" w:header="708" w:footer="708" w:gutter="0"/>
       <w:cols w:space="708"/>
@@ -25258,6 +25286,18 @@
       <w:ind w:left="220"/>
     </w:pPr>
   </w:style>
+  <w:style w:type="character" w:styleId="zmlenmeyenBahsetme">
+    <w:name w:val="Unresolved Mention"/>
+    <w:basedOn w:val="VarsaylanParagrafYazTipi"/>
+    <w:uiPriority w:val="99"/>
+    <w:semiHidden/>
+    <w:unhideWhenUsed/>
+    <w:rsid w:val="0026485B"/>
+    <w:rPr>
+      <w:color w:val="605E5C"/>
+      <w:shd w:val="clear" w:color="auto" w:fill="E1DFDD"/>
+    </w:rPr>
+  </w:style>
 </w:styles>
 </file>
 

</xml_diff>